<commit_message>
Update presentation script for clarity and coherence
</commit_message>
<xml_diff>
--- a/Docs/Presentation Script.docx
+++ b/Docs/Presentation Script.docx
@@ -17,489 +17,175 @@
     </w:p>
     <w:p>
       <w:r>
-        <w:t xml:space="preserve">Alright! So, I been getting more comfortable using agents to help </w:t>
-      </w:r>
-      <w:r>
-        <w:t>me write code</w:t>
-      </w:r>
-      <w:r>
-        <w:t>. And</w:t>
+        <w:t xml:space="preserve">Alright! So lately, I’ve been getting more comfortable with this idea of using agents to help me write code. Especially with those more human-in-the-loop </w:t>
+      </w:r>
+      <w:r>
+        <w:t>kind</w:t>
+      </w:r>
+      <w:r>
+        <w:t xml:space="preserve"> of workflows. That said, it’s quite a bit different than just prompting, copying, and pasting.</w:t>
+      </w:r>
+    </w:p>
+    <w:p>
+      <w:r>
+        <w:t xml:space="preserve">Agents </w:t>
+      </w:r>
+      <w:r>
+        <w:t>are</w:t>
+      </w:r>
+      <w:r>
+        <w:t xml:space="preserve"> actually </w:t>
+      </w:r>
+      <w:r>
+        <w:t xml:space="preserve">able to </w:t>
+      </w:r>
+      <w:r>
+        <w:t xml:space="preserve">do </w:t>
+      </w:r>
+      <w:r>
+        <w:t>quite a bit of autonomous</w:t>
+      </w:r>
+      <w:r>
+        <w:t xml:space="preserve"> planning and orchestrating</w:t>
+      </w:r>
+      <w:r>
+        <w:t>…</w:t>
+      </w:r>
+      <w:r>
+        <w:t xml:space="preserve"> using tools. </w:t>
+      </w:r>
+      <w:r>
+        <w:t>You can get them to</w:t>
+      </w:r>
+      <w:r>
+        <w:t xml:space="preserve"> make a bunch of API calls, query databases, and read documents. And then they </w:t>
+      </w:r>
+      <w:r>
+        <w:t>stitch all that information together in a way so that LLM’s are able to give you more reliable results</w:t>
+      </w:r>
+      <w:r>
+        <w:t xml:space="preserve">. </w:t>
+      </w:r>
+    </w:p>
+    <w:p>
+      <w:r>
+        <w:t>But more than that, you can actually get your agents to do things. Modify code, run builds, execute tests. You can get them to open pull requests, trigger CI/CD workflows, and even help you out with code reviews. Or maybe</w:t>
+      </w:r>
+      <w:r>
+        <w:t>… Maybe</w:t>
+      </w:r>
+      <w:r>
+        <w:t xml:space="preserve"> you </w:t>
+      </w:r>
+      <w:r>
+        <w:t>can get it to</w:t>
+      </w:r>
+      <w:r>
+        <w:t xml:space="preserve"> order</w:t>
+      </w:r>
+      <w:r>
+        <w:t xml:space="preserve"> you</w:t>
+      </w:r>
+      <w:r>
+        <w:t xml:space="preserve"> a cheeseburger. Get it delivered.</w:t>
+      </w:r>
+    </w:p>
+    <w:p>
+      <w:r>
+        <w:t>But</w:t>
       </w:r>
       <w:r>
         <w:t>, yeah,</w:t>
       </w:r>
       <w:r>
-        <w:t xml:space="preserve"> it’s</w:t>
+        <w:t xml:space="preserve"> like I said, to do all that, agents need tools. And, my goodness, there are so many tools!</w:t>
       </w:r>
       <w:r>
         <w:t xml:space="preserve"> </w:t>
       </w:r>
       <w:r>
-        <w:t xml:space="preserve">a bit more involved than </w:t>
-      </w:r>
-      <w:r>
-        <w:t>just</w:t>
-      </w:r>
-      <w:r>
-        <w:t xml:space="preserve"> prompting a chatbot</w:t>
-      </w:r>
-      <w:r>
-        <w:t xml:space="preserve">. </w:t>
-      </w:r>
-      <w:r>
-        <w:t>These a</w:t>
-      </w:r>
-      <w:r>
-        <w:t>gents are able to</w:t>
-      </w:r>
-      <w:r>
-        <w:t xml:space="preserve"> make plans and </w:t>
-      </w:r>
-      <w:r>
-        <w:t xml:space="preserve">do all sorts of </w:t>
-      </w:r>
-      <w:r>
-        <w:t>orchestrat</w:t>
-      </w:r>
-      <w:r>
-        <w:t xml:space="preserve">ion </w:t>
-      </w:r>
-      <w:r>
-        <w:t xml:space="preserve">with </w:t>
-      </w:r>
-      <w:r>
-        <w:t>their</w:t>
-      </w:r>
-      <w:r>
-        <w:t xml:space="preserve"> little </w:t>
-      </w:r>
-      <w:r>
-        <w:t>list</w:t>
-      </w:r>
-      <w:r>
-        <w:t xml:space="preserve"> of tools</w:t>
-      </w:r>
-      <w:r>
-        <w:t xml:space="preserve"> and services</w:t>
-      </w:r>
-      <w:r>
-        <w:t xml:space="preserve">. </w:t>
-      </w:r>
-      <w:r>
-        <w:t>You can get them to</w:t>
-      </w:r>
-      <w:r>
-        <w:t xml:space="preserve"> make calls to databases or document repositories</w:t>
-      </w:r>
-      <w:r>
-        <w:t>. Have them chunk up</w:t>
-      </w:r>
-      <w:r>
-        <w:t xml:space="preserve"> the results</w:t>
-      </w:r>
-      <w:r>
-        <w:t xml:space="preserve"> and pull together </w:t>
-      </w:r>
-      <w:r>
-        <w:t xml:space="preserve">more meaningful context windows; </w:t>
-      </w:r>
-      <w:r>
-        <w:t>help</w:t>
-      </w:r>
-      <w:r>
-        <w:t xml:space="preserve"> you</w:t>
-      </w:r>
-      <w:r>
-        <w:t xml:space="preserve"> beef up your request</w:t>
-      </w:r>
-      <w:r>
-        <w:t>s</w:t>
-      </w:r>
-      <w:r>
-        <w:t>. But more</w:t>
-      </w:r>
-      <w:r>
-        <w:t xml:space="preserve"> than that, they’re actually able </w:t>
-      </w:r>
-      <w:r>
-        <w:t xml:space="preserve">do things with </w:t>
-      </w:r>
-      <w:r>
-        <w:t>your</w:t>
-      </w:r>
-      <w:r>
-        <w:t xml:space="preserve"> request</w:t>
-      </w:r>
-      <w:r>
-        <w:t>s</w:t>
-      </w:r>
-      <w:r>
-        <w:t xml:space="preserve">. </w:t>
-      </w:r>
-      <w:r>
-        <w:t>M</w:t>
-      </w:r>
-      <w:r>
-        <w:t xml:space="preserve">odify code, build it, test it. </w:t>
-      </w:r>
-      <w:r>
-        <w:t>Ship it! You can get them to kick off workflows, submit pull requests, code reviews.</w:t>
-      </w:r>
-      <w:r>
-        <w:t xml:space="preserve"> Or maybe you just want</w:t>
-      </w:r>
-      <w:r>
-        <w:t xml:space="preserve"> them to order a cheeseburger. Get it delivered.</w:t>
+        <w:t>So, to help with that, the folks at Anthropic introduced this thing called Model Context Protocol. MCP. It’s an open standard that helps with discovering and invoking tools in a more regular way.</w:t>
+      </w:r>
+    </w:p>
+    <w:p>
+      <w:r>
+        <w:t xml:space="preserve">Still, when I first heard about it, I thought, “Man, </w:t>
+      </w:r>
+      <w:r>
+        <w:t>that</w:t>
+      </w:r>
+      <w:r>
+        <w:t xml:space="preserve"> can’t be good. Giving agents, known for their hallucinations and glazing, access to passwords and third-party systems?” But yeah, I guess it’s not that much different than publishing NuGet packages or SDKs. And enabling your client applications to make a bunch of API calls.</w:t>
+      </w:r>
+    </w:p>
+    <w:p>
+      <w:r>
+        <w:t>But</w:t>
+      </w:r>
+      <w:r>
+        <w:t xml:space="preserve"> yeah… S</w:t>
+      </w:r>
+      <w:r>
+        <w:t>till</w:t>
+      </w:r>
+      <w:r>
+        <w:t xml:space="preserve">, </w:t>
+      </w:r>
+      <w:r>
+        <w:t>I can’t help but feel a bit</w:t>
+      </w:r>
+      <w:r>
+        <w:t xml:space="preserve"> nervous. So</w:t>
+      </w:r>
+      <w:r>
+        <w:t>, yeah</w:t>
+      </w:r>
+      <w:r>
+        <w:t>,</w:t>
+      </w:r>
+      <w:r>
+        <w:t xml:space="preserve"> I figured, ok. What the heck! The best way to </w:t>
+      </w:r>
+      <w:r>
+        <w:t>deal with this</w:t>
       </w:r>
       <w:r>
         <w:t xml:space="preserve"> </w:t>
       </w:r>
-    </w:p>
-    <w:p>
-      <w:r>
-        <w:t>So yeah, to do</w:t>
-      </w:r>
-      <w:r>
-        <w:t xml:space="preserve"> all</w:t>
-      </w:r>
-      <w:r>
-        <w:t xml:space="preserve"> that, agents need tools. And</w:t>
-      </w:r>
-      <w:r>
-        <w:t>, my goodness,</w:t>
-      </w:r>
-      <w:r>
-        <w:t xml:space="preserve"> there are so many tools! </w:t>
+      <w:r>
+        <w:t>is</w:t>
+      </w:r>
+      <w:r>
+        <w:t xml:space="preserve"> to actually try </w:t>
+      </w:r>
+      <w:r>
+        <w:t>to</w:t>
+      </w:r>
+      <w:r>
+        <w:t xml:space="preserve"> build a</w:t>
+      </w:r>
+      <w:r>
+        <w:t xml:space="preserve">n </w:t>
+      </w:r>
+      <w:r>
+        <w:t xml:space="preserve">MCP </w:t>
       </w:r>
       <w:r>
         <w:t>S</w:t>
       </w:r>
       <w:r>
-        <w:t>o, t</w:t>
-      </w:r>
-      <w:r>
-        <w:t xml:space="preserve">o help with that, </w:t>
-      </w:r>
-      <w:r>
-        <w:t xml:space="preserve">the folks </w:t>
-      </w:r>
-      <w:r>
-        <w:t xml:space="preserve">at </w:t>
-      </w:r>
-      <w:r>
-        <w:t xml:space="preserve">Anthropic </w:t>
-      </w:r>
-      <w:r>
-        <w:t xml:space="preserve">went ahead and </w:t>
-      </w:r>
-      <w:r>
-        <w:t xml:space="preserve">codified </w:t>
-      </w:r>
-      <w:r>
-        <w:t>a standard</w:t>
-      </w:r>
-      <w:r>
-        <w:t xml:space="preserve"> protocol</w:t>
-      </w:r>
-      <w:r>
-        <w:t>. T</w:t>
-      </w:r>
-      <w:r>
-        <w:t>o help</w:t>
-      </w:r>
-      <w:r>
-        <w:t xml:space="preserve"> us out with</w:t>
-      </w:r>
-      <w:r>
-        <w:t xml:space="preserve"> discover</w:t>
-      </w:r>
-      <w:r>
-        <w:t>ing</w:t>
-      </w:r>
-      <w:r>
-        <w:t xml:space="preserve"> and invo</w:t>
-      </w:r>
-      <w:r>
-        <w:t>king</w:t>
-      </w:r>
-      <w:r>
-        <w:t xml:space="preserve"> </w:t>
-      </w:r>
-      <w:r>
-        <w:t>all</w:t>
-      </w:r>
-      <w:r>
-        <w:t xml:space="preserve"> these</w:t>
-      </w:r>
-      <w:r>
-        <w:t xml:space="preserve"> different</w:t>
-      </w:r>
-      <w:r>
-        <w:t xml:space="preserve"> services</w:t>
-      </w:r>
-      <w:r>
-        <w:t xml:space="preserve">. And make it easy to get them listed in </w:t>
-      </w:r>
-      <w:r>
-        <w:t>searchable</w:t>
-      </w:r>
-      <w:r>
-        <w:t xml:space="preserve"> </w:t>
-      </w:r>
-      <w:r>
-        <w:t>directories and marketplaces</w:t>
-      </w:r>
-      <w:r>
-        <w:t xml:space="preserve">. And so, </w:t>
-      </w:r>
-      <w:r>
-        <w:t xml:space="preserve">yeah, </w:t>
-      </w:r>
-      <w:r>
-        <w:t>you g</w:t>
-      </w:r>
-      <w:r>
-        <w:t xml:space="preserve">ot </w:t>
-      </w:r>
-      <w:r>
-        <w:t>“</w:t>
-      </w:r>
-      <w:r>
-        <w:t>MCP.</w:t>
-      </w:r>
-      <w:r>
-        <w:t>”</w:t>
-      </w:r>
-      <w:r>
-        <w:t xml:space="preserve"> Model Context Protocol. </w:t>
-      </w:r>
-    </w:p>
-    <w:p>
-      <w:r>
-        <w:t xml:space="preserve">Now, </w:t>
-      </w:r>
-      <w:r>
-        <w:t>i</w:t>
-      </w:r>
-      <w:r>
-        <w:t xml:space="preserve">t sounds </w:t>
-      </w:r>
-      <w:r>
-        <w:t xml:space="preserve">way </w:t>
-      </w:r>
-      <w:r>
-        <w:t xml:space="preserve">more complex than it </w:t>
-      </w:r>
-      <w:r>
-        <w:t xml:space="preserve">actually </w:t>
-      </w:r>
-      <w:r>
-        <w:t>is. I mean, when I first heard of it, I though</w:t>
-      </w:r>
-      <w:r>
-        <w:t>t: “M</w:t>
-      </w:r>
-      <w:r>
-        <w:t>an, this can’t be good. Giving agents, known for their hallucinations and glazing, access to passwords and 3</w:t>
-      </w:r>
-      <w:r>
-        <w:rPr>
-          <w:vertAlign w:val="superscript"/>
-        </w:rPr>
-        <w:t>rd</w:t>
-      </w:r>
-      <w:r>
-        <w:t>-party systems</w:t>
-      </w:r>
-      <w:r>
-        <w:t>!</w:t>
-      </w:r>
-      <w:r>
-        <w:t>”</w:t>
-      </w:r>
-      <w:r>
-        <w:t xml:space="preserve"> But, </w:t>
-      </w:r>
-      <w:r>
-        <w:t>yeah,</w:t>
-      </w:r>
-      <w:r>
-        <w:t xml:space="preserve"> </w:t>
-      </w:r>
-      <w:r>
-        <w:t xml:space="preserve">I guess it’s not </w:t>
-      </w:r>
-      <w:r>
-        <w:t xml:space="preserve">that </w:t>
-      </w:r>
-      <w:r>
-        <w:t>much different</w:t>
-      </w:r>
-      <w:r>
-        <w:t xml:space="preserve"> than publishing</w:t>
-      </w:r>
-      <w:r>
-        <w:t xml:space="preserve"> a bunch of</w:t>
-      </w:r>
-      <w:r>
-        <w:t xml:space="preserve"> </w:t>
-      </w:r>
-      <w:r>
-        <w:t>NuGet</w:t>
-      </w:r>
-      <w:r>
-        <w:t xml:space="preserve"> packages or SDKs </w:t>
-      </w:r>
-      <w:r>
-        <w:t>and</w:t>
-      </w:r>
-      <w:r>
-        <w:t xml:space="preserve"> enabl</w:t>
-      </w:r>
-      <w:r>
-        <w:t>ing</w:t>
-      </w:r>
-      <w:r>
-        <w:t xml:space="preserve"> </w:t>
-      </w:r>
-      <w:r>
-        <w:t xml:space="preserve">your client applications </w:t>
-      </w:r>
-      <w:r>
-        <w:t xml:space="preserve">to </w:t>
-      </w:r>
-      <w:r>
-        <w:t xml:space="preserve">make </w:t>
-      </w:r>
-      <w:r>
-        <w:t xml:space="preserve">a bunch of API </w:t>
-      </w:r>
-      <w:r>
-        <w:t>calls</w:t>
-      </w:r>
-      <w:r>
-        <w:t xml:space="preserve">. </w:t>
-      </w:r>
-      <w:r>
-        <w:t>All h</w:t>
-      </w:r>
-      <w:r>
-        <w:t>osted</w:t>
-      </w:r>
-      <w:r>
-        <w:t xml:space="preserve"> out</w:t>
-      </w:r>
-      <w:r>
-        <w:t xml:space="preserve"> there,</w:t>
-      </w:r>
-      <w:r>
-        <w:t xml:space="preserve"> </w:t>
-      </w:r>
-      <w:r>
-        <w:t>in the cloud</w:t>
-      </w:r>
-      <w:r>
-        <w:t xml:space="preserve"> somewhere</w:t>
-      </w:r>
-      <w:r>
-        <w:t xml:space="preserve">. </w:t>
-      </w:r>
-    </w:p>
-    <w:p>
-      <w:r>
-        <w:t>So</w:t>
-      </w:r>
-      <w:r>
-        <w:t xml:space="preserve"> yeah,</w:t>
-      </w:r>
-      <w:r>
-        <w:t xml:space="preserve"> I figured, what the heck</w:t>
-      </w:r>
-      <w:r>
-        <w:t>!</w:t>
-      </w:r>
-      <w:r>
-        <w:t xml:space="preserve"> Best way to get over </w:t>
-      </w:r>
-      <w:r>
-        <w:t xml:space="preserve">all </w:t>
-      </w:r>
-      <w:r>
-        <w:t>that</w:t>
-      </w:r>
-      <w:r>
-        <w:t xml:space="preserve"> </w:t>
-      </w:r>
-      <w:r>
-        <w:t>hesitation</w:t>
-      </w:r>
-      <w:r>
-        <w:t xml:space="preserve"> is to</w:t>
-      </w:r>
-      <w:r>
-        <w:t xml:space="preserve"> actually</w:t>
-      </w:r>
-      <w:r>
-        <w:t xml:space="preserve"> try and build </w:t>
-      </w:r>
-      <w:r>
-        <w:t>one for</w:t>
-      </w:r>
-      <w:r>
-        <w:t xml:space="preserve"> myself!</w:t>
-      </w:r>
-      <w:r>
-        <w:t xml:space="preserve"> A </w:t>
-      </w:r>
-      <w:r>
-        <w:t xml:space="preserve">little </w:t>
-      </w:r>
-      <w:r>
-        <w:t>proof-of-concept!</w:t>
-      </w:r>
-      <w:r>
-        <w:t xml:space="preserve"> </w:t>
-      </w:r>
-    </w:p>
-    <w:p>
-      <w:r>
-        <w:t>Now, t</w:t>
-      </w:r>
-      <w:r>
-        <w:t xml:space="preserve">his one’s going to be real simple. I call it </w:t>
-      </w:r>
-      <w:r>
-        <w:t>a</w:t>
-      </w:r>
-      <w:r>
-        <w:t xml:space="preserve"> </w:t>
-      </w:r>
-      <w:r>
-        <w:t>“</w:t>
-      </w:r>
-      <w:r>
-        <w:t>Coin Flip Service</w:t>
-      </w:r>
-      <w:r>
-        <w:t>”</w:t>
-      </w:r>
-      <w:r>
-        <w:t xml:space="preserve">. A little helper function that </w:t>
-      </w:r>
-      <w:r>
-        <w:t xml:space="preserve">going to </w:t>
-      </w:r>
-      <w:r>
-        <w:t xml:space="preserve">return heads or tails. Helps you make all the most important decisions in </w:t>
-      </w:r>
-      <w:r>
-        <w:t>your</w:t>
-      </w:r>
-      <w:r>
-        <w:t xml:space="preserve"> </w:t>
-      </w:r>
-      <w:r>
-        <w:t>life.</w:t>
+        <w:t>erver for myself! A little proof-of-concept!</w:t>
+      </w:r>
+    </w:p>
+    <w:p>
+      <w:r>
+        <w:t xml:space="preserve">Now, this one’s going to be real simple. I’m going to call it “Coin Flip Service.” A little helper function. Returns heads or tails. Helps you make all the </w:t>
+      </w:r>
+      <w:r>
+        <w:t xml:space="preserve">real </w:t>
+      </w:r>
+      <w:r>
+        <w:t>important decisions. Paper, plastic. Buy it, build it. Love it, leave it…</w:t>
       </w:r>
     </w:p>
     <w:p>
@@ -550,7 +236,11 @@
         <w:t>look like. Architecturally, that is.</w:t>
       </w:r>
       <w:r>
-        <w:t xml:space="preserve"> So yeah, I’m using VS Code with a GitHub Copilot Chat extension. And to tell it where my MCP Service is, I’ve got to register it.</w:t>
+        <w:t xml:space="preserve"> So yeah, I’m using VS Code with a GitHub Copilot Chat extension. And to tell it where my MCP Service is, I’ve got to register </w:t>
+      </w:r>
+      <w:r>
+        <w:lastRenderedPageBreak/>
+        <w:t>it.</w:t>
       </w:r>
       <w:r>
         <w:t xml:space="preserve"> So,</w:t>
@@ -606,7 +296,6 @@
     </w:p>
     <w:p>
       <w:r>
-        <w:lastRenderedPageBreak/>
         <w:t xml:space="preserve">In this case, I’m going real simple. It’s just a local .NET console app. Going to make </w:t>
       </w:r>
       <w:r>
@@ -1010,7 +699,11 @@
         <w:t xml:space="preserve"> the one.</w:t>
       </w:r>
       <w:r>
-        <w:t xml:space="preserve"> We’ll set some basic meta data. Name and Description. This is the text you’ll see</w:t>
+        <w:t xml:space="preserve"> We’ll set some basic meta data. Name and </w:t>
+      </w:r>
+      <w:r>
+        <w:lastRenderedPageBreak/>
+        <w:t>Description. This is the text you’ll see</w:t>
       </w:r>
       <w:r>
         <w:t xml:space="preserve"> in the UI,</w:t>
@@ -1081,11 +774,7 @@
         <w:t xml:space="preserve"> handlers. </w:t>
       </w:r>
       <w:r>
-        <w:t xml:space="preserve">Now, </w:t>
-      </w:r>
-      <w:r>
-        <w:lastRenderedPageBreak/>
-        <w:t xml:space="preserve">we got two main kinds of </w:t>
+        <w:t xml:space="preserve">Now, we got two main kinds of </w:t>
       </w:r>
       <w:r>
         <w:t xml:space="preserve">endpoints here. </w:t>
@@ -1130,7 +819,13 @@
         <w:t xml:space="preserve"> where</w:t>
       </w:r>
       <w:r>
-        <w:t xml:space="preserve"> execute the actual code</w:t>
+        <w:t xml:space="preserve"> </w:t>
+      </w:r>
+      <w:r>
+        <w:t xml:space="preserve">we </w:t>
+      </w:r>
+      <w:r>
+        <w:t>execute the actual code</w:t>
       </w:r>
       <w:r>
         <w:t xml:space="preserve">. </w:t>
@@ -1241,11 +936,9 @@
       <w:r>
         <w:t xml:space="preserve"> don’t forget to build it. </w:t>
       </w:r>
-      <w:proofErr w:type="gramStart"/>
-      <w:r>
-        <w:t>And,</w:t>
-      </w:r>
-      <w:proofErr w:type="gramEnd"/>
+      <w:r>
+        <w:t>And</w:t>
+      </w:r>
       <w:r>
         <w:t xml:space="preserve"> let’s</w:t>
       </w:r>
@@ -1512,7 +1205,7 @@
         <w:t>you got it</w:t>
       </w:r>
       <w:r>
-        <w:t xml:space="preserve"> running it in the session</w:t>
+        <w:t xml:space="preserve"> running in the session</w:t>
       </w:r>
       <w:r>
         <w:t>, you’ll</w:t>
@@ -1521,7 +1214,13 @@
         <w:t xml:space="preserve"> notice that it’s going to ask for permission. </w:t>
       </w:r>
       <w:r>
-        <w:t xml:space="preserve">It shows you that </w:t>
+        <w:t>It</w:t>
+      </w:r>
+      <w:r>
+        <w:t xml:space="preserve"> displays </w:t>
+      </w:r>
+      <w:r>
+        <w:t xml:space="preserve">that </w:t>
       </w:r>
       <w:r>
         <w:t xml:space="preserve"> information</w:t>
@@ -1535,6 +1234,7 @@
     </w:p>
     <w:p>
       <w:r>
+        <w:lastRenderedPageBreak/>
         <w:t xml:space="preserve">Now this part’s real important. They’ve got </w:t>
       </w:r>
       <w:r>
@@ -1559,7 +1259,13 @@
         <w:t>’ve got to</w:t>
       </w:r>
       <w:r>
-        <w:t xml:space="preserve"> make sure you can trust this thing. I mean, </w:t>
+        <w:t xml:space="preserve"> make sure </w:t>
+      </w:r>
+      <w:r>
+        <w:t xml:space="preserve">that </w:t>
+      </w:r>
+      <w:r>
+        <w:t xml:space="preserve">you can trust this thing. I mean, </w:t>
       </w:r>
       <w:r>
         <w:t>the agent could be handing off</w:t>
@@ -1595,212 +1301,287 @@
         <w:t xml:space="preserve"> </w:t>
       </w:r>
       <w:r>
-        <w:t>O</w:t>
-      </w:r>
-      <w:r>
-        <w:t>r</w:t>
-      </w:r>
-      <w:r>
-        <w:t>, worse,</w:t>
+        <w:t>Y</w:t>
+      </w:r>
+      <w:r>
+        <w:t>ou don’t know!</w:t>
       </w:r>
       <w:r>
         <w:t xml:space="preserve"> </w:t>
       </w:r>
       <w:r>
-        <w:t xml:space="preserve">maybe it just called a service hooked up to some nukes. </w:t>
-      </w:r>
-      <w:r>
-        <w:lastRenderedPageBreak/>
-        <w:t>Gonna blow things up out there in the real world</w:t>
-      </w:r>
-      <w:r>
-        <w:t>. You don’t know!</w:t>
+        <w:t>Or</w:t>
+      </w:r>
+      <w:r>
+        <w:t xml:space="preserve"> mayb</w:t>
+      </w:r>
+      <w:r>
+        <w:t xml:space="preserve">e </w:t>
+      </w:r>
+      <w:r>
+        <w:t>it’s just bad code</w:t>
+      </w:r>
+      <w:r>
+        <w:t xml:space="preserve">. </w:t>
+      </w:r>
+      <w:r>
+        <w:t>An</w:t>
       </w:r>
       <w:r>
         <w:t xml:space="preserve"> </w:t>
       </w:r>
       <w:r>
-        <w:t>Or</w:t>
-      </w:r>
-      <w:r>
-        <w:t xml:space="preserve"> maybe</w:t>
-      </w:r>
-      <w:r>
-        <w:t>… Maybe</w:t>
-      </w:r>
-      <w:r>
-        <w:t xml:space="preserve"> it’s just bad code</w:t>
+        <w:t>infinite loop that’s going to</w:t>
+      </w:r>
+      <w:r>
+        <w:t xml:space="preserve"> cause the agent to</w:t>
+      </w:r>
+      <w:r>
+        <w:t xml:space="preserve"> bur</w:t>
+      </w:r>
+      <w:r>
+        <w:t xml:space="preserve">n up all your tokens. </w:t>
+      </w:r>
+    </w:p>
+    <w:p>
+      <w:r>
+        <w:t>But</w:t>
+      </w:r>
+      <w:r>
+        <w:t xml:space="preserve"> yeah! </w:t>
+      </w:r>
+      <w:r>
+        <w:t xml:space="preserve">We know </w:t>
+      </w:r>
+      <w:r>
+        <w:t xml:space="preserve">who </w:t>
+      </w:r>
+      <w:r>
+        <w:t>built this one. So, you can c</w:t>
+      </w:r>
+      <w:r>
+        <w:t>lick allow for the session, the workspace, always.</w:t>
+      </w:r>
+      <w:r>
+        <w:t xml:space="preserve"> And there you go!</w:t>
+      </w:r>
+    </w:p>
+    <w:p>
+      <w:r>
+        <w:t xml:space="preserve">Now, </w:t>
+      </w:r>
+      <w:r>
+        <w:t xml:space="preserve">here you can see where we logged the request. </w:t>
+      </w:r>
+      <w:r>
+        <w:t xml:space="preserve">You’ll notice this one’s flagged as a warning. </w:t>
+      </w:r>
+      <w:r>
+        <w:t xml:space="preserve">Like I said before, we’re using the Standard Error </w:t>
+      </w:r>
+      <w:r>
+        <w:t>messaging</w:t>
+      </w:r>
+      <w:r>
+        <w:t>. We don’t want to clog</w:t>
+      </w:r>
+      <w:r>
+        <w:t xml:space="preserve"> up th</w:t>
+      </w:r>
+      <w:r>
+        <w:t>at</w:t>
+      </w:r>
+      <w:r>
+        <w:t xml:space="preserve"> Standard Out response</w:t>
+      </w:r>
+      <w:r>
+        <w:t xml:space="preserve"> channel</w:t>
+      </w:r>
+      <w:r>
+        <w:t>. Good enough for a</w:t>
+      </w:r>
+      <w:r>
+        <w:t xml:space="preserve"> demo.</w:t>
+      </w:r>
+    </w:p>
+    <w:p>
+      <w:r>
+        <w:t xml:space="preserve">All right! </w:t>
+      </w:r>
+      <w:r>
+        <w:t>B</w:t>
+      </w:r>
+      <w:r>
+        <w:t>ack in the chat</w:t>
+      </w:r>
+      <w:r>
+        <w:t>.</w:t>
+      </w:r>
+      <w:r>
+        <w:t xml:space="preserve"> </w:t>
+      </w:r>
+      <w:r>
+        <w:t>Now, it’s going to be helpful</w:t>
+      </w:r>
+      <w:r>
+        <w:t xml:space="preserve"> </w:t>
+      </w:r>
+      <w:r>
+        <w:t xml:space="preserve">to remember </w:t>
+      </w:r>
+      <w:r>
+        <w:t xml:space="preserve">that </w:t>
+      </w:r>
+      <w:r>
+        <w:t>the agent</w:t>
+      </w:r>
+      <w:r>
+        <w:t>’</w:t>
+      </w:r>
+      <w:r>
+        <w:t>s</w:t>
+      </w:r>
+      <w:r>
+        <w:t xml:space="preserve"> probably</w:t>
+      </w:r>
+      <w:r>
+        <w:t xml:space="preserve"> </w:t>
+      </w:r>
+      <w:r>
+        <w:t>keeping</w:t>
+      </w:r>
+      <w:r>
+        <w:t xml:space="preserve"> track of</w:t>
+      </w:r>
+      <w:r>
+        <w:t xml:space="preserve"> the </w:t>
+      </w:r>
+      <w:r>
+        <w:t>whole</w:t>
+      </w:r>
+      <w:r>
+        <w:t xml:space="preserve"> conversation</w:t>
+      </w:r>
+      <w:r>
+        <w:t xml:space="preserve">. Part of the </w:t>
+      </w:r>
+      <w:r>
+        <w:t xml:space="preserve">context window. So, </w:t>
+      </w:r>
+      <w:r>
+        <w:t xml:space="preserve">there’s a good chance it’s </w:t>
+      </w:r>
+      <w:r>
+        <w:t>going</w:t>
+      </w:r>
+      <w:r>
+        <w:t xml:space="preserve"> to remember what you mean by </w:t>
+      </w:r>
+      <w:r>
+        <w:t>“</w:t>
+      </w:r>
+      <w:r>
+        <w:t>coin flip</w:t>
+      </w:r>
+      <w:r>
+        <w:t>”</w:t>
+      </w:r>
+      <w:r>
+        <w:t xml:space="preserve"> or </w:t>
+      </w:r>
+      <w:r>
+        <w:t>“</w:t>
+      </w:r>
+      <w:r>
+        <w:t>flip a coin</w:t>
+      </w:r>
+      <w:r>
+        <w:t>”</w:t>
+      </w:r>
+      <w:r>
+        <w:t>, even if you don’t use the exact tool name. S</w:t>
+      </w:r>
+      <w:r>
+        <w:t>o, here, i</w:t>
+      </w:r>
+      <w:r>
+        <w:t>f I just ask it to flip a coin,</w:t>
+      </w:r>
+      <w:r>
+        <w:t xml:space="preserve"> i</w:t>
+      </w:r>
+      <w:r>
+        <w:t>t’s going to assume what I mean and call coin-underscore-flip again. That gets a little scary if you’ve got a bunch of similar tools wired up</w:t>
+      </w:r>
+      <w:r>
+        <w:t xml:space="preserve"> with similar names</w:t>
       </w:r>
       <w:r>
         <w:t xml:space="preserve">. </w:t>
       </w:r>
       <w:r>
-        <w:t>A vibe-coded an</w:t>
-      </w:r>
-      <w:r>
-        <w:t xml:space="preserve"> infinite loop that’s going to bur</w:t>
-      </w:r>
-      <w:r>
-        <w:t xml:space="preserve">n up all your tokens. </w:t>
-      </w:r>
-    </w:p>
-    <w:p>
-      <w:r>
-        <w:t>So yeah! Click allow for the session, the workspace, always.</w:t>
+        <w:t xml:space="preserve">LLMs are still prone to </w:t>
+      </w:r>
+      <w:r>
+        <w:t>hallucinat</w:t>
+      </w:r>
+      <w:r>
+        <w:t>ion. Or</w:t>
+      </w:r>
+      <w:r>
+        <w:t>, at least, they</w:t>
+      </w:r>
+      <w:r>
+        <w:t>’re making</w:t>
+      </w:r>
+      <w:r>
+        <w:t xml:space="preserve"> probabilistic guesses. </w:t>
+      </w:r>
+      <w:r>
+        <w:t>And t</w:t>
+      </w:r>
+      <w:r>
+        <w:t xml:space="preserve">hat’s </w:t>
+      </w:r>
+      <w:r>
+        <w:t>be</w:t>
+      </w:r>
+      <w:r>
+        <w:t>cause</w:t>
+      </w:r>
+      <w:r>
+        <w:t xml:space="preserve"> English is squishy. So yeah. Keep an eye on that.</w:t>
       </w:r>
       <w:r>
         <w:t xml:space="preserve"> </w:t>
       </w:r>
       <w:r>
-        <w:t xml:space="preserve">Just do it. </w:t>
-      </w:r>
-      <w:r>
-        <w:t>Do it!</w:t>
-      </w:r>
-    </w:p>
-    <w:p>
-      <w:r>
-        <w:t xml:space="preserve">Now, </w:t>
-      </w:r>
-      <w:r>
-        <w:t xml:space="preserve">here you can see where we logged the request. </w:t>
-      </w:r>
-      <w:r>
-        <w:t xml:space="preserve">You’ll notice this one’s flagged as a warning. </w:t>
-      </w:r>
-      <w:r>
-        <w:t xml:space="preserve">Like I said before, we’re using the Standard Error </w:t>
-      </w:r>
-      <w:r>
-        <w:t>messaging,</w:t>
-      </w:r>
-      <w:r>
-        <w:t xml:space="preserve"> so we don’t muddy up the Standard Out responses. Good enough for a</w:t>
-      </w:r>
-      <w:r>
-        <w:t xml:space="preserve"> demo.</w:t>
-      </w:r>
-    </w:p>
-    <w:p>
-      <w:r>
-        <w:t xml:space="preserve">All right! </w:t>
-      </w:r>
-      <w:r>
-        <w:t>Now, b</w:t>
-      </w:r>
-      <w:r>
-        <w:t>ack in the chat</w:t>
-      </w:r>
-      <w:r>
-        <w:t xml:space="preserve">, it’s good </w:t>
-      </w:r>
-      <w:r>
-        <w:t>to remember the agent</w:t>
-      </w:r>
-      <w:r>
-        <w:t>’</w:t>
-      </w:r>
-      <w:r>
-        <w:t xml:space="preserve">s going to remember the full conversation that </w:t>
-      </w:r>
-      <w:r>
-        <w:t>it’s got stored in its</w:t>
-      </w:r>
-      <w:r>
-        <w:t xml:space="preserve"> context window. So, it’s </w:t>
-      </w:r>
-      <w:r>
-        <w:t>probably going</w:t>
-      </w:r>
-      <w:r>
-        <w:t xml:space="preserve"> to remember what you mean by coin flip</w:t>
-      </w:r>
-      <w:r>
-        <w:t xml:space="preserve"> or flip a coin</w:t>
-      </w:r>
-      <w:r>
-        <w:t>, even if you don’t use the exact tool name. S</w:t>
-      </w:r>
-      <w:r>
-        <w:t>o, here, i</w:t>
-      </w:r>
-      <w:r>
-        <w:t>f I just ask it to flip a coin,</w:t>
-      </w:r>
-      <w:r>
-        <w:t xml:space="preserve"> i</w:t>
-      </w:r>
-      <w:r>
-        <w:t>t’s going to assume what I mean and call coin-underscore-flip again. That gets a little scary if you’ve got a bunch of similar tools wired up</w:t>
-      </w:r>
-      <w:r>
-        <w:t xml:space="preserve"> with similar names</w:t>
-      </w:r>
-      <w:r>
-        <w:t xml:space="preserve">. </w:t>
-      </w:r>
-      <w:r>
-        <w:t xml:space="preserve">LLMs are still prone to </w:t>
-      </w:r>
-      <w:r>
-        <w:t>hallucinat</w:t>
-      </w:r>
-      <w:r>
-        <w:t>ion. Or</w:t>
-      </w:r>
-      <w:r>
-        <w:t>, at least, they</w:t>
-      </w:r>
-      <w:r>
-        <w:t>’re making</w:t>
-      </w:r>
-      <w:r>
-        <w:t xml:space="preserve"> probabilistic guesses. </w:t>
-      </w:r>
-      <w:r>
-        <w:t>And t</w:t>
-      </w:r>
-      <w:r>
-        <w:t xml:space="preserve">hat’s </w:t>
-      </w:r>
-      <w:r>
-        <w:t>be</w:t>
-      </w:r>
-      <w:r>
-        <w:t>cause</w:t>
-      </w:r>
-      <w:r>
-        <w:t xml:space="preserve"> English is squishy. So yeah. Keep an eye on that.</w:t>
+        <w:t>Of course, y</w:t>
+      </w:r>
+      <w:r>
+        <w:t>ou can mitigate it with</w:t>
+      </w:r>
+      <w:r>
+        <w:t xml:space="preserve"> more </w:t>
+      </w:r>
+      <w:r>
+        <w:t xml:space="preserve">a </w:t>
+      </w:r>
+      <w:r>
+        <w:t>formal prompt</w:t>
+      </w:r>
+      <w:r>
+        <w:t xml:space="preserve"> structure using one-shot or multi-shot examples</w:t>
+      </w:r>
+      <w:r>
+        <w:t>.</w:t>
       </w:r>
       <w:r>
         <w:t xml:space="preserve"> </w:t>
       </w:r>
       <w:r>
-        <w:t>Of course, y</w:t>
-      </w:r>
-      <w:r>
-        <w:t>ou can mitigate it with</w:t>
-      </w:r>
-      <w:r>
-        <w:t xml:space="preserve"> more formal prompts. Use</w:t>
-      </w:r>
-      <w:r>
-        <w:t xml:space="preserve"> multi-shot</w:t>
-      </w:r>
-      <w:r>
-        <w:t xml:space="preserve"> or templates</w:t>
-      </w:r>
-      <w:r>
-        <w:t>.</w:t>
-      </w:r>
-      <w:r>
-        <w:t xml:space="preserve"> </w:t>
-      </w:r>
-      <w:proofErr w:type="gramStart"/>
-      <w:r>
-        <w:t>And,</w:t>
-      </w:r>
-      <w:proofErr w:type="gramEnd"/>
+        <w:t>But</w:t>
+      </w:r>
       <w:r>
         <w:t xml:space="preserve"> yeah… that’s it!</w:t>
       </w:r>
@@ -1883,177 +1664,45 @@
     </w:p>
     <w:p>
       <w:r>
-        <w:t>Pretty</w:t>
-      </w:r>
-      <w:r>
-        <w:t xml:space="preserve"> basic. Except, it’s kind of </w:t>
-      </w:r>
-      <w:r>
-        <w:t xml:space="preserve">not, </w:t>
-      </w:r>
-      <w:r>
-        <w:t>is it</w:t>
-      </w:r>
-      <w:r>
-        <w:t xml:space="preserve">? I mean, once you </w:t>
-      </w:r>
-      <w:r>
-        <w:t xml:space="preserve">actually </w:t>
-      </w:r>
-      <w:r>
-        <w:t xml:space="preserve">start adding complexity and risk into the mix, </w:t>
-      </w:r>
-      <w:r>
-        <w:t xml:space="preserve">then </w:t>
-      </w:r>
-      <w:r>
-        <w:t xml:space="preserve">you got to do all the things you do with any </w:t>
-      </w:r>
-      <w:r>
-        <w:t>client-server architecture. Think about your bounded contexts, responsibilities, security, threat modeling, compliance, auditing, and so on.</w:t>
-      </w:r>
-      <w:r>
-        <w:t xml:space="preserve"> Remember, this was just a proof-of-concept. You’re not going to be using it in production.</w:t>
-      </w:r>
-    </w:p>
-    <w:p>
-      <w:r>
-        <w:t xml:space="preserve">The real difference here, and this is what makes it scary, is the speed at which we </w:t>
-      </w:r>
-      <w:r>
-        <w:t xml:space="preserve">can enable people to </w:t>
-      </w:r>
-      <w:r>
-        <w:t xml:space="preserve">enable </w:t>
-      </w:r>
-      <w:r>
-        <w:t>their</w:t>
-      </w:r>
-      <w:r>
-        <w:t xml:space="preserve"> chat bots. After a while, it </w:t>
-      </w:r>
-      <w:r>
-        <w:t>starts to</w:t>
-      </w:r>
-      <w:r>
-        <w:t xml:space="preserve"> become a trigger-finger</w:t>
-      </w:r>
-      <w:r>
-        <w:t xml:space="preserve"> response, </w:t>
-      </w:r>
-      <w:r>
-        <w:t>pressing that “allow” button</w:t>
-      </w:r>
-      <w:r>
-        <w:t xml:space="preserve"> a whole bunch of time</w:t>
-      </w:r>
-      <w:r>
-        <w:t xml:space="preserve">. Or worse, you </w:t>
-      </w:r>
-      <w:r>
-        <w:t xml:space="preserve">just </w:t>
-      </w:r>
-      <w:r>
-        <w:t xml:space="preserve">forgot about it. </w:t>
+        <w:t>Pretty basic. Except it’s kind of not, is it?</w:t>
+      </w:r>
+    </w:p>
+    <w:p>
+      <w:r>
+        <w:t>I mean, once you start adding real complexity and risk into the mix, then you’ve got to think about all the usual stuff that comes with any client-server architecture.</w:t>
       </w:r>
     </w:p>
     <w:p>
       <w:r>
         <w:lastRenderedPageBreak/>
-        <w:t xml:space="preserve">Unless you peel back </w:t>
-      </w:r>
-      <w:r>
-        <w:t xml:space="preserve">all </w:t>
-      </w:r>
-      <w:r>
-        <w:t xml:space="preserve">the code or </w:t>
-      </w:r>
-      <w:r>
-        <w:t xml:space="preserve">you </w:t>
-      </w:r>
-      <w:r>
-        <w:t xml:space="preserve">really trust that third-party provider, you don’t know all the things </w:t>
-      </w:r>
-      <w:r>
-        <w:t>your agent’s allowed to</w:t>
-      </w:r>
-      <w:r>
-        <w:t xml:space="preserve"> do. And neither does the agent. </w:t>
-      </w:r>
-      <w:r>
-        <w:t>Where’s it storing your credential</w:t>
-      </w:r>
-      <w:r>
-        <w:t xml:space="preserve">? </w:t>
-      </w:r>
-      <w:r>
-        <w:t>How many</w:t>
-      </w:r>
-      <w:r>
-        <w:t xml:space="preserve"> calls are it making? Who’s paying for</w:t>
-      </w:r>
-      <w:r>
-        <w:t xml:space="preserve">? God </w:t>
-      </w:r>
-      <w:proofErr w:type="gramStart"/>
-      <w:r>
-        <w:t>forbid,</w:t>
-      </w:r>
-      <w:proofErr w:type="gramEnd"/>
-      <w:r>
-        <w:t xml:space="preserve"> you</w:t>
-      </w:r>
-      <w:r>
-        <w:t xml:space="preserve"> end up with</w:t>
-      </w:r>
-      <w:r>
-        <w:t xml:space="preserve"> a </w:t>
-      </w:r>
-      <w:r>
-        <w:t>nasty</w:t>
-      </w:r>
-      <w:r>
-        <w:t xml:space="preserve"> bill next month. </w:t>
-      </w:r>
-    </w:p>
-    <w:p>
-      <w:r>
-        <w:t>The biggest problem with agents and chat bots</w:t>
-      </w:r>
-      <w:r>
-        <w:t xml:space="preserve"> is the amount of information</w:t>
-      </w:r>
-      <w:r>
-        <w:t xml:space="preserve"> they throw back at you.</w:t>
-      </w:r>
-      <w:r>
-        <w:t xml:space="preserve"> A wall of text. The c</w:t>
-      </w:r>
-      <w:r>
-        <w:t xml:space="preserve">ognitive overload is unavoidable. And you’re only human. Even though you’re still accountable. So yeah. Have </w:t>
-      </w:r>
-      <w:r>
-        <w:t>fun</w:t>
-      </w:r>
-      <w:r>
-        <w:t>…</w:t>
-      </w:r>
-      <w:r>
-        <w:t xml:space="preserve"> </w:t>
-      </w:r>
-      <w:r>
-        <w:t>B</w:t>
-      </w:r>
-      <w:r>
-        <w:t>ut</w:t>
-      </w:r>
-      <w:r>
-        <w:t xml:space="preserve"> be careful!</w:t>
-      </w:r>
-    </w:p>
-    <w:p>
-      <w:r>
-        <w:t>My name’s Steve, and you can catch me on YouTube or LinkedIn. I’ll see you there!</w:t>
+        <w:t xml:space="preserve">Just remember, what I showed you is just a proof-of-concept. Don’t use it in production. But it does show off how easy it can be to enable an agent to act and affect change beyond the scope of </w:t>
+      </w:r>
+      <w:r>
+        <w:t>an</w:t>
+      </w:r>
+      <w:r>
+        <w:t xml:space="preserve"> IDE. Especially with all those MCP extensions out there.</w:t>
+      </w:r>
+    </w:p>
+    <w:p>
+      <w:r>
+        <w:t>And that can be real empowering, but also kind of scary. I mean, these agents can move a whole lot faster than we can. But at the end of the day, it’s still you and me who’s accountable.</w:t>
+      </w:r>
+    </w:p>
+    <w:p>
+      <w:r>
+        <w:t>So yeah. Have fun... But just be careful!</w:t>
+      </w:r>
+    </w:p>
+    <w:p>
+      <w:r>
+        <w:t xml:space="preserve">Alright! My name’s Steve. </w:t>
+      </w:r>
+      <w:r>
+        <w:t>And y</w:t>
+      </w:r>
+      <w:r>
+        <w:t>ou can catch me on YouTube or LinkedIn. I’ll see you there.</w:t>
       </w:r>
     </w:p>
     <w:sectPr>

</xml_diff>

<commit_message>
Update presentation script for improved content and clarity
</commit_message>
<xml_diff>
--- a/Docs/Presentation Script.docx
+++ b/Docs/Presentation Script.docx
@@ -132,19 +132,28 @@
         <w:t xml:space="preserve">, </w:t>
       </w:r>
       <w:r>
-        <w:t>I can’t help but feel a bit</w:t>
-      </w:r>
-      <w:r>
-        <w:t xml:space="preserve"> nervous. So</w:t>
-      </w:r>
-      <w:r>
-        <w:t>, yeah</w:t>
-      </w:r>
-      <w:r>
-        <w:t>,</w:t>
-      </w:r>
-      <w:r>
-        <w:t xml:space="preserve"> I figured, ok. What the heck! The best way to </w:t>
+        <w:t>I can’t help but feel a</w:t>
+      </w:r>
+      <w:r>
+        <w:t xml:space="preserve"> little </w:t>
+      </w:r>
+      <w:r>
+        <w:t>bit</w:t>
+      </w:r>
+      <w:r>
+        <w:t xml:space="preserve"> nervous. </w:t>
+      </w:r>
+      <w:r>
+        <w:t>But then,</w:t>
+      </w:r>
+      <w:r>
+        <w:t xml:space="preserve"> I figured</w:t>
+      </w:r>
+      <w:r>
+        <w:t>..</w:t>
+      </w:r>
+      <w:r>
+        <w:t xml:space="preserve">. What the heck! The best way to </w:t>
       </w:r>
       <w:r>
         <w:t>deal with this</w:t>
@@ -1130,7 +1139,13 @@
     </w:p>
     <w:p>
       <w:r>
-        <w:t>Now this is neat. Click the manage button and open the output tab. You can see it</w:t>
+        <w:t xml:space="preserve">Now this is neat. Click the manage button and open the output tab. </w:t>
+      </w:r>
+      <w:r>
+        <w:t xml:space="preserve">Get it running. </w:t>
+      </w:r>
+      <w:r>
+        <w:t>You can see it</w:t>
       </w:r>
       <w:r>
         <w:t>’</w:t>
@@ -1143,12 +1158,6 @@
       </w:r>
       <w:r>
         <w:t xml:space="preserve"> life cycle. </w:t>
-      </w:r>
-      <w:r>
-        <w:t>Get</w:t>
-      </w:r>
-      <w:r>
-        <w:t xml:space="preserve"> it running. </w:t>
       </w:r>
       <w:r>
         <w:t>And w</w:t>
@@ -1357,10 +1366,34 @@
         <w:t xml:space="preserve">who </w:t>
       </w:r>
       <w:r>
-        <w:t>built this one. So, you can c</w:t>
-      </w:r>
-      <w:r>
-        <w:t>lick allow for the session, the workspace, always.</w:t>
+        <w:t xml:space="preserve">built this one. So, you can </w:t>
+      </w:r>
+      <w:r>
+        <w:t xml:space="preserve">go ahead and </w:t>
+      </w:r>
+      <w:r>
+        <w:t>c</w:t>
+      </w:r>
+      <w:r>
+        <w:t xml:space="preserve">lick </w:t>
+      </w:r>
+      <w:r>
+        <w:t>“</w:t>
+      </w:r>
+      <w:r>
+        <w:t>allow</w:t>
+      </w:r>
+      <w:r>
+        <w:t>”</w:t>
+      </w:r>
+      <w:r>
+        <w:t xml:space="preserve"> for</w:t>
+      </w:r>
+      <w:r>
+        <w:t>:</w:t>
+      </w:r>
+      <w:r>
+        <w:t xml:space="preserve"> the session, the workspace, always.</w:t>
       </w:r>
       <w:r>
         <w:t xml:space="preserve"> And there you go!</w:t>
@@ -1374,25 +1407,49 @@
         <w:t xml:space="preserve">here you can see where we logged the request. </w:t>
       </w:r>
       <w:r>
-        <w:t xml:space="preserve">You’ll notice this one’s flagged as a warning. </w:t>
+        <w:t xml:space="preserve">You’ll notice this one’s flagged as a </w:t>
+      </w:r>
+      <w:r>
+        <w:t>“</w:t>
+      </w:r>
+      <w:r>
+        <w:t>warning</w:t>
+      </w:r>
+      <w:r>
+        <w:t>”</w:t>
+      </w:r>
+      <w:r>
+        <w:t xml:space="preserve">. </w:t>
       </w:r>
       <w:r>
         <w:t xml:space="preserve">Like I said before, we’re using the Standard Error </w:t>
       </w:r>
       <w:r>
-        <w:t>messaging</w:t>
+        <w:t>for logging</w:t>
       </w:r>
       <w:r>
         <w:t>. We don’t want to clog</w:t>
       </w:r>
       <w:r>
-        <w:t xml:space="preserve"> up th</w:t>
-      </w:r>
-      <w:r>
-        <w:t>at</w:t>
-      </w:r>
-      <w:r>
-        <w:t xml:space="preserve"> Standard Out response</w:t>
+        <w:t xml:space="preserve"> up </w:t>
+      </w:r>
+      <w:r>
+        <w:t>the</w:t>
+      </w:r>
+      <w:r>
+        <w:t xml:space="preserve"> Standard</w:t>
+      </w:r>
+      <w:r>
+        <w:t>-</w:t>
+      </w:r>
+      <w:r>
+        <w:t>Out</w:t>
+      </w:r>
+      <w:r>
+        <w:t>-R</w:t>
+      </w:r>
+      <w:r>
+        <w:t>esponse</w:t>
       </w:r>
       <w:r>
         <w:t xml:space="preserve"> channel</w:t>

</xml_diff>

<commit_message>
Update presentation script artifacts
</commit_message>
<xml_diff>
--- a/Docs/Presentation Script.docx
+++ b/Docs/Presentation Script.docx
@@ -1726,7 +1726,21 @@
     </w:p>
     <w:p>
       <w:r>
-        <w:t>I mean, once you start adding real complexity and risk into the mix, then you’ve got to think about all the usual stuff that comes with any client-server architecture.</w:t>
+        <w:t xml:space="preserve">I mean, once you start </w:t>
+      </w:r>
+      <w:proofErr w:type="spellStart"/>
+      <w:r>
+        <w:t>addin</w:t>
+      </w:r>
+      <w:proofErr w:type="spellEnd"/>
+      <w:r>
+        <w:t xml:space="preserve"> </w:t>
+      </w:r>
+      <w:r>
+        <w:t xml:space="preserve"> </w:t>
+      </w:r>
+      <w:r>
+        <w:t>g real complexity and risk into the mix, then you’ve got to think about all the usual stuff that comes with any client-server architecture.</w:t>
       </w:r>
     </w:p>
     <w:p>

</xml_diff>